<commit_message>
Traumatisme: marchează „Gât” ca subcapitol nou (QC de consistență)
Control mecanic al propunerilor (coduri Tip / Indicație / Grad vs vocabularul
ghidului; nume subcapitole vs cele reale din GHID.csv): singura scăpare —
subcapitolul propus „Gât” din Traumatisme nu există încă, era nemarcat.
Aliniat la convenția „(subcapitol nou)”. Restul: totul valid.

Co-Authored-By: Claude Sonnet 5 <noreply@anthropic.com>
Claude-Session: https://claude.ai/code/session_01CB1qxeCwYtJ1rmMiMw8agr
</commit_message>
<xml_diff>
--- a/pentru-editori/02-traumatisme/02-traumatisme.docx
+++ b/pentru-editori/02-traumatisme/02-traumatisme.docx
@@ -273,7 +273,7 @@
         <w:rPr>
           <w:color w:val="1C5D8C"/>
         </w:rPr>
-        <w:t>Gât — Traumatism cervical penetrant (plagă înjunghiată / împușcată; zonele I/II/III)</w:t>
+        <w:t>Gât (subcapitol nou) — Traumatism cervical penetrant (plagă înjunghiată / împușcată; zonele I/II/III)</w:t>
       </w:r>
     </w:p>
     <w:p>
@@ -552,7 +552,7 @@
         <w:rPr>
           <w:color w:val="1C5D8C"/>
         </w:rPr>
-        <w:t>Gât — Leziune laringo-traheală (traumatism cervical închis)</w:t>
+        <w:t>Gât (subcapitol nou) — Leziune laringo-traheală (traumatism cervical închis)</w:t>
       </w:r>
     </w:p>
     <w:p>
@@ -831,7 +831,7 @@
         <w:rPr>
           <w:color w:val="1C5D8C"/>
         </w:rPr>
-        <w:t>Gât — Leziune faringo-esofagiană</w:t>
+        <w:t>Gât (subcapitol nou) — Leziune faringo-esofagiană</w:t>
       </w:r>
     </w:p>
     <w:p>

</xml_diff>